<commit_message>
Convert presentation script to Traditional Chinese
Co-authored-by: sayhitoagnes <sayhitoagnes@users.noreply.github.com>
</commit_message>
<xml_diff>
--- a/hr-chat-box-deck/exports/HR-Chat-Box-繁體中文講稿.docx
+++ b/hr-chat-box-deck/exports/HR-Chat-Box-繁體中文講稿.docx
@@ -8,7 +8,7 @@
         <w:jc w:val="center"/>
       </w:pPr>
       <w:r>
-        <w:t>HR Chat Box 中文简报讲稿</w:t>
+        <w:t>HR Chat Box 中文簡報講稿</w:t>
       </w:r>
     </w:p>
     <w:p>
@@ -16,7 +16,7 @@
         <w:pStyle w:val="Heading1"/>
       </w:pPr>
       <w:r>
-        <w:t>第 1 页｜HR Chat Box：实时政策问答</w:t>
+        <w:t>第 1 頁｜HR Chat Box：實時政策問答</w:t>
       </w:r>
     </w:p>
     <w:p>
@@ -24,7 +24,7 @@
         <w:spacing w:after="160" w:line="324" w:lineRule="auto"/>
       </w:pPr>
       <w:r>
-        <w:t>各位好，今天我想介绍的是 HR Chat Box。</w:t>
+        <w:t>各位好，今天我想介紹的是 HR Chat Box。</w:t>
       </w:r>
     </w:p>
     <w:p>
@@ -32,7 +32,7 @@
         <w:spacing w:after="160" w:line="324" w:lineRule="auto"/>
       </w:pPr>
       <w:r>
-        <w:t>这是一个面向办公室员工的人力资源知识库聊天机器人，目标是让员工可以随时、即时地查询公司政策、员工福利，以及日常工作指引。</w:t>
+        <w:t>這是一個面向辦公室員工的人力資源知識庫聊天機器人，目標是讓員工可以隨時、即時地查詢公司政策、員工福利，以及日常工作指引。</w:t>
       </w:r>
     </w:p>
     <w:p>
@@ -40,7 +40,7 @@
         <w:spacing w:after="160" w:line="324" w:lineRule="auto"/>
       </w:pPr>
       <w:r>
-        <w:t>我们希望解决的核心问题是：当员工遇到常见的人事问题时，不需要等待 HR 回复，也不需要在多份文件中反复寻找资料，而是可以直接获得清晰、一致、以政策为依据的答案。</w:t>
+        <w:t>我們希望解決的核心問題是：當員工遇到常見的人事問題時，不需要等待 HR 回覆，也不需要在多份文件中反覆尋找資料，而是可以直接獲得清晰、一致、以政策為依據的答案。</w:t>
       </w:r>
     </w:p>
     <w:p>
@@ -48,7 +48,7 @@
         <w:spacing w:after="160" w:line="324" w:lineRule="auto"/>
       </w:pPr>
       <w:r>
-        <w:t>这个方案主要为 HR 管理层及本次工作坊的持份者而设计。它的价值可以概括为三点：即时回答、统一的政策入口，以及提升 HR 团队的工作效率。</w:t>
+        <w:t>這個方案主要為 HR 管理層及本次工作坊的持份者而設計。它的價值可以概括為三點：即時回答、統一的政策入口，以及提升 HR 團隊的工作效率。</w:t>
       </w:r>
     </w:p>
     <w:p>
@@ -56,7 +56,7 @@
         <w:pStyle w:val="Heading1"/>
       </w:pPr>
       <w:r>
-        <w:t>第 2 页｜解决方案：把政策文件转化为即时答案</w:t>
+        <w:t>第 2 頁｜解決方案：把政策文件轉化為即時答案</w:t>
       </w:r>
     </w:p>
     <w:p>
@@ -64,7 +64,7 @@
         <w:spacing w:after="160" w:line="324" w:lineRule="auto"/>
       </w:pPr>
       <w:r>
-        <w:t>HR Chat Box 的核心，是把原本较难查阅的政策文件转化为容易提问、容易理解的即时回答。</w:t>
+        <w:t>HR Chat Box 的核心，是把原本較難查閲的政策文件轉化為容易提問、容易理解的即時回答。</w:t>
       </w:r>
     </w:p>
     <w:p>
@@ -72,7 +72,7 @@
         <w:spacing w:after="160" w:line="324" w:lineRule="auto"/>
       </w:pPr>
       <w:r>
-        <w:t>员工可以用自然语言提问，例如：「我有多少天年假？」、「八号风球时是否需要回办公室？」或「我的医疗福利包括什么？」系统会从已获 HR 批准的知识库中寻找相关内容，并即时提供答案。</w:t>
+        <w:t>員工可以用自然語言提問，例如：「我有多少天年假？」、「八號風球時是否需要回辦公室？」或「我的醫療福利包括什麼？」系統會從已獲 HR 批准的知識庫中尋找相關內容，並即時提供答案。</w:t>
       </w:r>
     </w:p>
     <w:p>
@@ -80,7 +80,7 @@
         <w:spacing w:after="160" w:line="324" w:lineRule="auto"/>
       </w:pPr>
       <w:r>
-        <w:t>这项方案的重要性在于三个方面。</w:t>
+        <w:t>這項方案的重要性在於三個方面。</w:t>
       </w:r>
     </w:p>
     <w:p>
@@ -88,7 +88,7 @@
         <w:spacing w:after="160" w:line="324" w:lineRule="auto"/>
       </w:pPr>
       <w:r>
-        <w:t>第一，员工可在任何时间获得清晰指引，不需要等待 HR 的人工回复。</w:t>
+        <w:t>第一，員工可在任何時間獲得清晰指引，不需要等待 HR 的人工回覆。</w:t>
       </w:r>
     </w:p>
     <w:p>
@@ -96,7 +96,7 @@
         <w:spacing w:after="160" w:line="324" w:lineRule="auto"/>
       </w:pPr>
       <w:r>
-        <w:t>第二，所有员工都从同一个可信的政策来源获得答案，减少因不同理解或不同版本文件而造成的不一致。</w:t>
+        <w:t>第二，所有員工都從同一個可信的政策來源獲得答案，減少因不同理解或不同版本文件而造成的不一致。</w:t>
       </w:r>
     </w:p>
     <w:p>
@@ -104,7 +104,7 @@
         <w:spacing w:after="160" w:line="324" w:lineRule="auto"/>
       </w:pPr>
       <w:r>
-        <w:t>第三，HR 团队可以减少重复回答常见问题，把时间集中在复杂、例外或需要判断的个案上。</w:t>
+        <w:t>第三，HR 團隊可以減少重複回答常見問題，把時間集中在複雜、例外或需要判斷的個案上。</w:t>
       </w:r>
     </w:p>
     <w:p>
@@ -112,7 +112,7 @@
         <w:pStyle w:val="Heading1"/>
       </w:pPr>
       <w:r>
-        <w:t>第 3 页｜使用范围：办公室员工与 HR 营运团队</w:t>
+        <w:t>第 3 頁｜使用範圍：辦公室員工與 HR 營運團隊</w:t>
       </w:r>
     </w:p>
     <w:p>
@@ -120,7 +120,7 @@
         <w:spacing w:after="160" w:line="324" w:lineRule="auto"/>
       </w:pPr>
       <w:r>
-        <w:t>本阶段的使用对象主要分为两类：办公室员工，以及 HR／HR Operations 团队。</w:t>
+        <w:t>本階段的使用對象主要分為兩類：辦公室員工，以及 HR／HR Operations 團隊。</w:t>
       </w:r>
     </w:p>
     <w:p>
@@ -128,7 +128,7 @@
         <w:spacing w:after="160" w:line="324" w:lineRule="auto"/>
       </w:pPr>
       <w:r>
-        <w:t>对于办公室员工来说，HR Chat Box 可以协助他们查询福利、公司政策及入职相关问题，并提供全天候、以政策为依据的即时答案。</w:t>
+        <w:t>對於辦公室員工來説，HR Chat Box 可以協助他們查詢福利、公司政策及入職相關問題，並提供全天候、以政策為依據的即時答案。</w:t>
       </w:r>
     </w:p>
     <w:p>
@@ -136,7 +136,7 @@
         <w:spacing w:after="160" w:line="324" w:lineRule="auto"/>
       </w:pPr>
       <w:r>
-        <w:t>对于 HR 及 HR Operations 团队来说，系统的角色不只是回答问题，更是一个知识管理工具。HR 可以更新和维护知识库；当员工提出未能解答或较复杂的问题时，HR 可以接手处理；同时，团队也可以追踪最常被查询的主题，作为日后优化政策内容和 FAQ 的依据。</w:t>
+        <w:t>對於 HR 及 HR Operations 團隊來説，系統的角色不只是回答問題，更是一個知識管理工具。HR 可以更新和維護知識庫；當員工提出未能解答或較複雜的問題時，HR 可以接手處理；同時，團隊也可以追蹤最常被查詢的主題，作為日後優化政策內容和 FAQ 的依據。</w:t>
       </w:r>
     </w:p>
     <w:p>
@@ -144,7 +144,7 @@
         <w:spacing w:after="160" w:line="324" w:lineRule="auto"/>
       </w:pPr>
       <w:r>
-        <w:t>为保持 MVP 的目标清晰，本阶段暂不包括前线员工。这样我们可以先聚焦办公室员工的政策和福利查询情境，验证产品的实际使用价值。</w:t>
+        <w:t>為保持 MVP 的目標清晰，本階段暫不包括前線員工。這樣我們可以先聚焦辦公室員工的政策和福利查詢情境，驗證產品的實際使用價值。</w:t>
       </w:r>
     </w:p>
     <w:p>
@@ -152,7 +152,7 @@
         <w:pStyle w:val="Heading1"/>
       </w:pPr>
       <w:r>
-        <w:t>第 4 页｜知识库：每个可信回答的内容基础</w:t>
+        <w:t>第 4 頁｜知識庫：每個可信回答的內容基礎</w:t>
       </w:r>
     </w:p>
     <w:p>
@@ -160,7 +160,7 @@
         <w:spacing w:after="160" w:line="324" w:lineRule="auto"/>
       </w:pPr>
       <w:r>
-        <w:t>HR Chat Box 的回答必须建立在获批准的人力资源资料之上，而不是从公开互联网搜寻答案。</w:t>
+        <w:t>HR Chat Box 的回答必須建立在獲批准的人力資源資料之上，而不是從公開互聯網搜尋答案。</w:t>
       </w:r>
     </w:p>
     <w:p>
@@ -168,7 +168,7 @@
         <w:spacing w:after="160" w:line="324" w:lineRule="auto"/>
       </w:pPr>
       <w:r>
-        <w:t>知识库主要包含四类内容。</w:t>
+        <w:t>知識庫主要包含四類內容。</w:t>
       </w:r>
     </w:p>
     <w:p>
@@ -176,7 +176,7 @@
         <w:spacing w:after="160" w:line="324" w:lineRule="auto"/>
       </w:pPr>
       <w:r>
-        <w:t>第一类是 HR 政策与员工手册，包括请假政策、行为守则、遥距工作指引，以及办公室日常守则。</w:t>
+        <w:t>第一類是 HR 政策與員工手冊，包括請假政策、行為守則、遙距工作指引，以及辦公室日常守則。</w:t>
       </w:r>
     </w:p>
     <w:p>
@@ -184,7 +184,7 @@
         <w:spacing w:after="160" w:line="324" w:lineRule="auto"/>
       </w:pPr>
       <w:r>
-        <w:t>第二类是福利与津贴文件，例如医疗保险选项、退休计划、健康津贴，以及费用报销流程。</w:t>
+        <w:t>第二類是福利與津貼文件，例如醫療保險選項、退休計劃、健康津貼，以及費用報銷流程。</w:t>
       </w:r>
     </w:p>
     <w:p>
@@ -192,7 +192,7 @@
         <w:spacing w:after="160" w:line="324" w:lineRule="auto"/>
       </w:pPr>
       <w:r>
-        <w:t>第三类是现有 FAQ 数据库，把常见员工问题及已预先批准的标准答案集中管理。</w:t>
+        <w:t>第三類是現有 FAQ 數據庫，把常見員工問題及已預先批准的標準答案集中管理。</w:t>
       </w:r>
     </w:p>
     <w:p>
@@ -200,7 +200,7 @@
         <w:spacing w:after="160" w:line="324" w:lineRule="auto"/>
       </w:pPr>
       <w:r>
-        <w:t>第四类是 AI Credit 数据，包括每位员工每月的 AI 使用额度和使用纪录。</w:t>
+        <w:t>第四類是 AI Credit 數據，包括每位員工每月的 AI 使用額度和使用紀錄。</w:t>
       </w:r>
     </w:p>
     <w:p>
@@ -208,7 +208,7 @@
         <w:spacing w:after="160" w:line="324" w:lineRule="auto"/>
       </w:pPr>
       <w:r>
-        <w:t>这种设计的重点是「可信及可控」。HR 可以确保聊天机器人的回答来自最新、获审批的内部资料，而不是未经验证的外部资讯。</w:t>
+        <w:t>這種設計的重點是「可信及可控」。HR 可以確保聊天機器人的回答來自最新、獲審批的內部資料，而不是未經驗證的外部資訊。</w:t>
       </w:r>
     </w:p>
     <w:p>
@@ -216,7 +216,7 @@
         <w:pStyle w:val="Heading1"/>
       </w:pPr>
       <w:r>
-        <w:t>第 5 页｜MVP 功能：四项核心能力</w:t>
+        <w:t>第 5 頁｜MVP 功能：四項核心能力</w:t>
       </w:r>
     </w:p>
     <w:p>
@@ -224,7 +224,7 @@
         <w:spacing w:after="160" w:line="324" w:lineRule="auto"/>
       </w:pPr>
       <w:r>
-        <w:t>这个 MVP 有四项核心功能。</w:t>
+        <w:t>這個 MVP 有四項核心功能。</w:t>
       </w:r>
     </w:p>
     <w:p>
@@ -232,7 +232,7 @@
         <w:spacing w:after="160" w:line="324" w:lineRule="auto"/>
       </w:pPr>
       <w:r>
-        <w:t>第一，是即时且准确的回答。员工提出有关政策、福利或工作指引的问题后，系统会从获批准的知识库中即时提供相关答案。这项基本能力已经在今天的原型中展示。</w:t>
+        <w:t>第一，是即時且準確的回答。員工提出有關政策、福利或工作指引的問題後，系統會從獲批准的知識庫中即時提供相關答案。這項基本能力已經在今天的原型中展示。</w:t>
       </w:r>
     </w:p>
     <w:p>
@@ -240,7 +240,7 @@
         <w:spacing w:after="160" w:line="324" w:lineRule="auto"/>
       </w:pPr>
       <w:r>
-        <w:t>第二，是联络 HR 的升级机制。当问题复杂、涉及个人情况，或系统无法有信心地回答时，员工可以转交给 HR 作人工跟进。</w:t>
+        <w:t>第二，是聯絡 HR 的升級機制。當問題複雜、涉及個人情況，或系統無法有信心地回答時，員工可以轉交給 HR 作人工跟進。</w:t>
       </w:r>
     </w:p>
     <w:p>
@@ -248,7 +248,7 @@
         <w:spacing w:after="160" w:line="324" w:lineRule="auto"/>
       </w:pPr>
       <w:r>
-        <w:t>第三，是每月 AI Credit 管理。系统会按用户设定每月使用额度，并在额度不足时作出提示。这可以帮助公司有秩序地管理 AI 使用量和成本。</w:t>
+        <w:t>第三，是每月 AI Credit 管理。系統會按用户設定每月使用額度，並在額度不足時作出提示。這可以幫助公司有秩序地管理 AI 使用量和成本。</w:t>
       </w:r>
     </w:p>
     <w:p>
@@ -256,7 +256,7 @@
         <w:spacing w:after="160" w:line="324" w:lineRule="auto"/>
       </w:pPr>
       <w:r>
-        <w:t>第四，是 HR 管理员内容后台。HR 管理员可以上传、修改和管理政策文件及 FAQ 内容，确保知识库保持最新。</w:t>
+        <w:t>第四，是 HR 管理員內容後台。HR 管理員可以上傳、修改和管理政策文件及 FAQ 內容，確保知識庫保持最新。</w:t>
       </w:r>
     </w:p>
     <w:p>
@@ -264,7 +264,7 @@
         <w:spacing w:after="160" w:line="324" w:lineRule="auto"/>
       </w:pPr>
       <w:r>
-        <w:t>总体而言，前两项功能确保员工获得支持；后两项功能则确保系统在使用量和内容治理方面保持可控。</w:t>
+        <w:t>總體而言，前兩項功能確保員工獲得支持；後兩項功能則確保系統在使用量和內容治理方面保持可控。</w:t>
       </w:r>
     </w:p>
     <w:p>
@@ -272,7 +272,7 @@
         <w:pStyle w:val="Heading1"/>
       </w:pPr>
       <w:r>
-        <w:t>第 6 页｜用户旅程：八号风球的查询情境</w:t>
+        <w:t>第 6 頁｜用户旅程：八號風球的查詢情境</w:t>
       </w:r>
     </w:p>
     <w:p>
@@ -280,7 +280,7 @@
         <w:spacing w:after="160" w:line="324" w:lineRule="auto"/>
       </w:pPr>
       <w:r>
-        <w:t>接下来以一个实际情境说明用户流程。</w:t>
+        <w:t>接下來以一個實際情境説明用户流程。</w:t>
       </w:r>
     </w:p>
     <w:p>
@@ -288,7 +288,7 @@
         <w:spacing w:after="160" w:line="324" w:lineRule="auto"/>
       </w:pPr>
       <w:r>
-        <w:t>某个风雨早晨，员工看到八号风球生效，需要确认当天应否到办公室工作，还是可以在家工作。</w:t>
+        <w:t>某個風雨早晨，員工看到八號風球生效，需要確認當天應否到辦公室工作，還是可以在家工作。</w:t>
       </w:r>
     </w:p>
     <w:p>
@@ -296,7 +296,7 @@
         <w:spacing w:after="160" w:line="324" w:lineRule="auto"/>
       </w:pPr>
       <w:r>
-        <w:t>第一步，员工打开 HR Chat Box。</w:t>
+        <w:t>第一步，員工打開 HR Chat Box。</w:t>
       </w:r>
     </w:p>
     <w:p>
@@ -304,7 +304,7 @@
         <w:spacing w:after="160" w:line="324" w:lineRule="auto"/>
       </w:pPr>
       <w:r>
-        <w:t>第二步，系统先验证员工当月是否仍有足够的 AI Credit。</w:t>
+        <w:t>第二步，系統先驗證員工當月是否仍有足夠的 AI Credit。</w:t>
       </w:r>
     </w:p>
     <w:p>
@@ -312,7 +312,7 @@
         <w:spacing w:after="160" w:line="324" w:lineRule="auto"/>
       </w:pPr>
       <w:r>
-        <w:t>第三步，员工输入问题：「我今天需要回办公室，还是可以在家工作？」</w:t>
+        <w:t>第三步，員工輸入問題：「我今天需要回辦公室，還是可以在家工作？」</w:t>
       </w:r>
     </w:p>
     <w:p>
@@ -320,7 +320,7 @@
         <w:spacing w:after="160" w:line="324" w:lineRule="auto"/>
       </w:pPr>
       <w:r>
-        <w:t>第四步，系统读取最新的恶劣天气政策，并即时回复：在八号风球生效时，办公室员工应按政策安排遥距工作。同时，系统会从该员工当月额度中扣除 1 个 AI Credit。</w:t>
+        <w:t>第四步，系統讀取最新的惡劣天氣政策，並即時回覆：在八號風球生效時，辦公室員工應按政策安排遙距工作。同時，系統會從該員工當月額度中扣除 1 個 AI Credit。</w:t>
       </w:r>
     </w:p>
     <w:p>
@@ -328,7 +328,7 @@
         <w:spacing w:after="160" w:line="324" w:lineRule="auto"/>
       </w:pPr>
       <w:r>
-        <w:t>第五步，如果员工提出的是较复杂或很个别的问题，而系统无法根据政策作出明确回答，系统便会提供联络 HR 的选项，由 HR 人员作进一步跟进。</w:t>
+        <w:t>第五步，如果員工提出的是較複雜或很個別的問題，而系統無法根據政策作出明確回答，系統便會提供聯絡 HR 的選項，由 HR 人員作進一步跟進。</w:t>
       </w:r>
     </w:p>
     <w:p>
@@ -336,7 +336,7 @@
         <w:spacing w:after="160" w:line="324" w:lineRule="auto"/>
       </w:pPr>
       <w:r>
-        <w:t>这个流程展示了 HR Chat Box 的理想体验：员工在数秒内获得清晰、有政策依据的答案，同时公司亦能有效管理 AI 使用额度。</w:t>
+        <w:t>這個流程展示了 HR Chat Box 的理想體驗：員工在數秒內獲得清晰、有政策依據的答案，同時公司亦能有效管理 AI 使用額度。</w:t>
       </w:r>
     </w:p>
     <w:p>
@@ -344,7 +344,7 @@
         <w:pStyle w:val="Heading1"/>
       </w:pPr>
       <w:r>
-        <w:t>第 7 页｜下一步：由工作坊原型走向受控上线</w:t>
+        <w:t>第 7 頁｜下一步：由工作坊原型走向受控上線</w:t>
       </w:r>
     </w:p>
     <w:p>
@@ -352,7 +352,7 @@
         <w:spacing w:after="160" w:line="324" w:lineRule="auto"/>
       </w:pPr>
       <w:r>
-        <w:t>在本次工作坊中，我们已经完成 HTML 聊天原型。</w:t>
+        <w:t>在本次工作坊中，我們已經完成 HTML 聊天原型。</w:t>
       </w:r>
     </w:p>
     <w:p>
@@ -360,7 +360,7 @@
         <w:spacing w:after="160" w:line="324" w:lineRule="auto"/>
       </w:pPr>
       <w:r>
-        <w:t>目前原型已包括员工手册、医疗福利及《雇佣条例》相关问答，并设有快速 FAQ 入口，方便员工直接查询年假权益、恶劣天气安排及员工福利。</w:t>
+        <w:t>目前原型已包括員工手冊、醫療福利及《僱傭條例》相關問答，並設有快速 FAQ 入口，方便員工直接查詢年假權益、惡劣天氣安排及員工福利。</w:t>
       </w:r>
     </w:p>
     <w:p>
@@ -368,7 +368,7 @@
         <w:spacing w:after="160" w:line="324" w:lineRule="auto"/>
       </w:pPr>
       <w:r>
-        <w:t>下一阶段可优先发展三项能力。</w:t>
+        <w:t>下一階段可優先發展三項能力。</w:t>
       </w:r>
     </w:p>
     <w:p>
@@ -376,7 +376,7 @@
         <w:spacing w:after="160" w:line="324" w:lineRule="auto"/>
       </w:pPr>
       <w:r>
-        <w:t>第一，启用真正的 Contact HR 转介功能，让无法解答的问题可以有清晰的人工跟进流程。</w:t>
+        <w:t>第一，啓用真正的 Contact HR 轉介功能，讓無法解答的問題可以有清晰的人工跟進流程。</w:t>
       </w:r>
     </w:p>
     <w:p>
@@ -384,7 +384,7 @@
         <w:spacing w:after="160" w:line="324" w:lineRule="auto"/>
       </w:pPr>
       <w:r>
-        <w:t>第二，完成每月 AI Credit 的自动执行及低余额提示功能。</w:t>
+        <w:t>第二，完成每月 AI Credit 的自動執行及低餘額提示功能。</w:t>
       </w:r>
     </w:p>
     <w:p>
@@ -392,7 +392,7 @@
         <w:spacing w:after="160" w:line="324" w:lineRule="auto"/>
       </w:pPr>
       <w:r>
-        <w:t>第三，强化 HR 管理知识库的后台，让 HR 团队可以方便地维护内容、更新文件及管理 FAQ。</w:t>
+        <w:t>第三，強化 HR 管理知識庫的後台，讓 HR 團隊可以方便地維護內容、更新文件及管理 FAQ。</w:t>
       </w:r>
     </w:p>
     <w:p>
@@ -400,7 +400,7 @@
         <w:spacing w:after="160" w:line="324" w:lineRule="auto"/>
       </w:pPr>
       <w:r>
-        <w:t>我们希望持份者可以协助确认两项重点：第一，哪些政策和福利文件应优先纳入知识库；第二，每月 AI Credit 的使用规则和额度应如何制定。确认后，团队便可按优先次序推进升级功能。</w:t>
+        <w:t>我們希望持份者可以協助確認兩項重點：第一，哪些政策和福利文件應優先納入知識庫；第二，每月 AI Credit 的使用規則和額度應如何制定。確認後，團隊便可按優先次序推進升級功能。</w:t>
       </w:r>
     </w:p>
     <w:p>
@@ -408,7 +408,7 @@
         <w:pStyle w:val="Heading1"/>
       </w:pPr>
       <w:r>
-        <w:t>第 8 页｜谢谢</w:t>
+        <w:t>第 8 頁｜謝謝</w:t>
       </w:r>
     </w:p>
     <w:p>
@@ -416,7 +416,7 @@
         <w:spacing w:after="160" w:line="324" w:lineRule="auto"/>
       </w:pPr>
       <w:r>
-        <w:t>以上是 HR Chat Box 的介绍。</w:t>
+        <w:t>以上是 HR Chat Box 的介紹。</w:t>
       </w:r>
     </w:p>
     <w:p>
@@ -424,7 +424,7 @@
         <w:spacing w:after="160" w:line="324" w:lineRule="auto"/>
       </w:pPr>
       <w:r>
-        <w:t>这个方案的重点并不是取代 HR，而是让 HR 的专业支援更容易被员工获得：常见问题可以即时处理，复杂问题则交由 HR 作有价值的人际判断与跟进。</w:t>
+        <w:t>這個方案的重點並不是取代 HR，而是讓 HR 的專業支援更容易被員工獲得：常見問題可以即時處理，複雜問題則交由 HR 作有價值的人際判斷與跟進。</w:t>
       </w:r>
     </w:p>
     <w:p>
@@ -432,7 +432,7 @@
         <w:spacing w:after="160" w:line="324" w:lineRule="auto"/>
       </w:pPr>
       <w:r>
-        <w:t>谢谢各位今天的时间，欢迎提出问题及意见。</w:t>
+        <w:t>謝謝各位今天的時間，歡迎提出問題及意見。</w:t>
       </w:r>
     </w:p>
     <w:sectPr>

</xml_diff>